<commit_message>
fix(mcl): replace retired MHRA SmPC addresses for brexu-cel and epcoritamab
</commit_message>
<xml_diff>
--- a/docs/mcl-v2.1/production-candidate/guideline-v2.1.docx
+++ b/docs/mcl-v2.1/production-candidate/guideline-v2.1.docx
@@ -46670,7 +46670,28 @@
           <w:spacing w:val="0"/>
           <w:color w:val="132E67"/>
         </w:rPr>
-        <w:t xml:space="preserve">MHRA SmPC — Epcoritamab</w:t>
+        <w:t xml:space="preserve">MHRA SmPC — Epcoritamab 4 mg/0.8 ml</w:t>
+      </w:r>
+      <w:r>
+        <w:rPr>
+          <w:rFonts w:ascii="Georgia" w:hAnsi="Georgia" w:cs="Georgia"/>
+          <w:sz w:val="34"/>
+          <w:sz-cs w:val="34"/>
+          <w:spacing w:val="0"/>
+          <w:color w:val="121826"/>
+        </w:rPr>
+        <w:t xml:space="preserve"> </w:t>
+      </w:r>
+      <w:r>
+        <w:rPr>
+          <w:rFonts w:ascii="Georgia" w:hAnsi="Georgia" w:cs="Georgia"/>
+          <w:sz w:val="34"/>
+          <w:sz-cs w:val="34"/>
+          <w:u w:val="single"/>
+          <w:spacing w:val="0"/>
+          <w:color w:val="132E67"/>
+        </w:rPr>
+        <w:t xml:space="preserve">MHRA SmPC — Epcoritamab 48 mg</w:t>
       </w:r>
       <w:r>
         <w:rPr>

</xml_diff>